<commit_message>
vbhc-vn v2.0.1: chuẩn plugin + vá SZ13 tận gốc (fill_template run chủ đạo, 7/9 template thiếu 13pt, guard PDF cho qa_pdf_check, demo 3/3 QA PASS)
</commit_message>
<xml_diff>
--- a/vbhc-vn/templates/02-to-trinh.docx
+++ b/vbhc-vn/templates/02-to-trinh.docx
@@ -194,7 +194,7 @@
                 <w:b/>
                 <w:sz w:val="26"/>
               </w:rPr>
-              <w:t xml:space="preserve">CỘNG HOÀ XÃ HỘI CHỦ NGHĨA VIỆT </w:t>
+              <w:t xml:space="preserve">CỘNG HÒA XÃ HỘI CHỦ NGHĨA VIỆT </w:t>
             </w:r>
             <w:smartTag w:uri="urn:schemas-microsoft-com:office:smarttags" w:element="place">
               <w:smartTag w:uri="urn:schemas-microsoft-com:office:smarttags" w:element="country-region">
@@ -220,7 +220,7 @@
               <w:rPr>
                 <w:b/>
               </w:rPr>
-              <w:t>Độc lập - Tự do - Hạnh phúc</w:t>
+              <w:t>Độc lập – Tự do – Hạnh phúc</w:t>
             </w:r>
           </w:p>
           <w:p>
@@ -329,30 +329,35 @@
             <w:r>
               <w:rPr>
                 <w:i/>
+                <w:sz w:val="26"/>
               </w:rPr>
               <w:t>Lào Cai</w:t>
             </w:r>
             <w:r>
               <w:rPr>
                 <w:i/>
+                <w:sz w:val="26"/>
               </w:rPr>
               <w:t xml:space="preserve">, ngày       tháng </w:t>
             </w:r>
             <w:r>
               <w:rPr>
                 <w:i/>
+                <w:sz w:val="26"/>
               </w:rPr>
               <w:t xml:space="preserve">     </w:t>
             </w:r>
             <w:r>
               <w:rPr>
                 <w:i/>
+                <w:sz w:val="26"/>
               </w:rPr>
               <w:t xml:space="preserve"> năm 202</w:t>
             </w:r>
             <w:r>
               <w:rPr>
                 <w:i/>
+                <w:sz w:val="26"/>
               </w:rPr>
               <w:t>6</w:t>
             </w:r>

</xml_diff>